<commit_message>
Rewrite statistics section in plain language with explicit significance verdicts
Section 4 of the report now explains p-values, IC, and IR in accessible terms
and states plainly whether each result is significant and what that does (and
doesn't) imply about real-world profitability, tying back to the liquidity
caveats in section 3.
</commit_message>
<xml_diff>
--- a/台股漲停策略回測報告.docx
+++ b/台股漲停策略回測報告.docx
@@ -587,7 +587,7 @@
           <w:b w:val="0"/>
           <w:i w:val="0"/>
         </w:rPr>
-        <w:t>同一天常有數十檔股票同時漲停，彼此報酬率高度相關；若把每一筆交易都當獨立樣本做檢定，會嚴重高估統計顯著性。以下主要檢定先把交易「按日聚合」成每日平均報酬率，再以「交易日數」當作有效樣本數。</w:t>
+        <w:t>這一節想回答一個很單純的問題：前面看到的報酬率差異，會不會只是運氣、剛好在這半年被我們遇到？還是背後真的有穩定、可重複的規律？統計上用「p 值」來回答這個問題——p 值可以理解成：『假設這個策略其實完全沒用、賺賠都是隨機的，我們卻觀察到這麼極端的數據，機率會有多低』。p 值越小，代表「純粹運氣」這個解釋越說不通；一般會用 p &lt; 0.05（5%）當作「統計上顯著」的門檻。另外要注意：同一天常有數十檔股票一起漲停，彼此的報酬率會互相牽動、不是各自獨立，所以下面的檢定都先把同一天的交易合併成一個數字，再用「交易日數」而不是「交易筆數」當樣本數，避免把統計顯著性灌水。</w:t>
       </w:r>
     </w:p>
     <w:p>
@@ -598,7 +598,7 @@
         <w:rPr>
           <w:rFonts w:ascii="微軟正黑體" w:hAnsi="微軟正黑體" w:eastAsia="微軟正黑體"/>
         </w:rPr>
-        <w:t>4.1 單樣本 t 檢定（按日聚合）：平均報酬率是否顯著不為 0</w:t>
+        <w:t>4.1 鎖死跟未鎖死，報酬率是不是真的不一樣？</w:t>
       </w:r>
     </w:p>
     <w:p>
@@ -608,7 +608,7 @@
           <w:b w:val="0"/>
           <w:i w:val="0"/>
         </w:rPr>
-        <w:t>檢定對象是「交易日報酬率」這個序列本身，不是累積報酬率：同一天若有多筆交易，先在當天內做等權重平均，得到一個代表當天的報酬率數字；把所有交易日的這個數字排成一個序列（整體 121 天、僅鎖死 120 天、僅未鎖死 121 天），再檢定這個序列的平均值是否顯著不為 0。因為用的是「每一天各自的報酬率」而非隨時間持續平滑的累積/移動平均，不會有「樣本數一多就必然顯著」的問題。</w:t>
+        <w:t>作法：同一天如果有好幾筆交易，先平均成一個「當天報酬率」；整體、僅鎖死、僅未鎖死各自累積出一串「每天報酬率」的數字（大約 120 天），再檢查這串數字平均起來是不是顯著大於或小於 0。</w:t>
       </w:r>
     </w:p>
     <w:tbl>
@@ -925,7 +925,17 @@
           <w:b w:val="0"/>
           <w:i w:val="0"/>
         </w:rPr>
-        <w:t>（鎖死 vs 未鎖死兩組報酬率的差異，本報告不另外做組間檢定：未鎖死組的出場價定義上恆 ≤ 進場價（收盤價不可能高於當天最高價），因此該組報酬率 ≤ 0 是策略定義的數學必然，兩組「有顯著差異」這件事本身不需要用假設檢定去驗證，做了也只是在檢定一個恆成立的定義。）</w:t>
+        <w:t>白話解讀：僅鎖死組平均每天賺 3.07%，p 值小到幾乎是 0，代表這不太可能是巧合；僅未鎖死組平均每天虧 3.88%，同樣是極端顯著的虧損；兩者混在一起的整體，平均每天賺 0.94%，也顯著大於 0。三個結果都指向同一個結論：是顯著的——鎖死賺、未鎖死虧這個規律在半年、上百個交易日裡反覆出現，不是少數幾天的好運撐出來的。</w:t>
+      </w:r>
+    </w:p>
+    <w:p>
+      <w:r>
+        <w:rPr>
+          <w:rFonts w:ascii="微軟正黑體" w:hAnsi="微軟正黑體" w:eastAsia="微軟正黑體"/>
+          <w:b w:val="0"/>
+          <w:i w:val="0"/>
+        </w:rPr>
+        <w:t>（鎖死組跟未鎖死組哪個比較賺，這裡不另外做一個「兩組差異」的檢定：未鎖死組的出場價依定義恆 ≤ 進場價（收盤價不可能高於當天最高價），這組報酬率 ≤ 0 是規則本身造成的，不是需要驗證的統計問題，硬做檢定只是在檢定一個恆成立的定義。）</w:t>
       </w:r>
     </w:p>
     <w:p>
@@ -936,7 +946,7 @@
         <w:rPr>
           <w:rFonts w:ascii="微軟正黑體" w:hAnsi="微軟正黑體" w:eastAsia="微軟正黑體"/>
         </w:rPr>
-        <w:t>4.2 IC / IR 分析</w:t>
+        <w:t>4.2 「鎖死」這個訊號，預測力穩不穩定？（IC / IR）</w:t>
       </w:r>
     </w:p>
     <w:p>
@@ -946,7 +956,17 @@
           <w:b w:val="0"/>
           <w:i w:val="0"/>
         </w:rPr>
-        <w:t>訊號：當天是否鎖死漲停（1=鎖死，0=未鎖死）；結果：該筆交易的實際報酬率。每個交易日計算一次橫斷面 Spearman 相關係數（= 當天的 IC），再把所有交易日的 IC 收集成時間序列，取平均值與標準差的比值作為 IR（概念上類似夏普比率，只是拿 IC 取代報酬率），衡量這個訊號的預測力是否每天都穩定，而不只是平均起來顯著。</w:t>
+        <w:t>IC（Information Coefficient）：每天分別檢查「這檔股票今天有沒有鎖死」跟「它的報酬率高低」是不是同方向——鎖死的股票報酬率排名越是明顯偏高，IC 就越接近 1；兩者完全沒關係，IC 就接近 0。</w:t>
+      </w:r>
+    </w:p>
+    <w:p>
+      <w:r>
+        <w:rPr>
+          <w:rFonts w:ascii="微軟正黑體" w:hAnsi="微軟正黑體" w:eastAsia="微軟正黑體"/>
+          <w:b w:val="0"/>
+          <w:i w:val="0"/>
+        </w:rPr>
+        <w:t>IR（Information Ratio）：只看平均 IC 還不夠，因為可能是少數幾天特別準、其他天都在亂猜。IR 把每天的 IC 拿來算「平均值 ÷ 波動度」，概念上很像投資常聽到的夏普比率——IR 越高，代表這個訊號不只平均有效，而且幾乎每天都穩定有效，不是靠運氣。</w:t>
       </w:r>
     </w:p>
     <w:tbl>
@@ -1142,6 +1162,26 @@
         </w:tc>
       </w:tr>
     </w:tbl>
+    <w:p>
+      <w:r>
+        <w:rPr>
+          <w:rFonts w:ascii="微軟正黑體" w:hAnsi="微軟正黑體" w:eastAsia="微軟正黑體"/>
+          <w:b w:val="0"/>
+          <w:i w:val="0"/>
+        </w:rPr>
+        <w:t>白話解讀：平均 IC 高達 0.66（滿分 1），算是非常強的相關性；IR 達 4.2，代表這個效應不只平均起來明顯，過去半年裡幾乎天天成立，不是少數幾天特別準造成的錯覺。p 值同樣遠小於 0.05，是顯著的，「鎖死能預測較高報酬」這件事不太可能是巧合。</w:t>
+      </w:r>
+    </w:p>
+    <w:p>
+      <w:r>
+        <w:rPr>
+          <w:rFonts w:ascii="微軟正黑體" w:hAnsi="微軟正黑體" w:eastAsia="微軟正黑體"/>
+          <w:b w:val="0"/>
+          <w:i w:val="0"/>
+        </w:rPr>
+        <w:t>小結：以上三個檢定的答案都一樣——統計上顯著，這個規律很可能是真實存在、不是雜訊。但「統計顯著」只代表「這個現象大概率不是巧合」，不等於「現實中一定賺得到這筆錢」：能不能真的變現，取決於第三節提到的「鎖死當下買不買得到」，這才是最終能不能賺錢的關鍵。</w:t>
+      </w:r>
+    </w:p>
     <w:p>
       <w:pPr>
         <w:pStyle w:val="Heading1"/>

</xml_diff>

<commit_message>
Add 0.3% sell-side transaction tax to market-wide limit-up backtest
All per-trade pnl/pnl_pct in find_trades() now net of the Taiwan
securities transaction tax (0.3% of sell price), which propagates
through every downstream stat, chart, and the Word report. Report
text updated to state costs are tax-adjusted but still commission-free,
and the previously hardcoded 4.1 commentary numbers are now computed
dynamically from the stats dict instead of being frozen pre-tax figures.
</commit_message>
<xml_diff>
--- a/台股漲停策略回測報告.docx
+++ b/台股漲停策略回測報告.docx
@@ -41,7 +41,7 @@
           <w:b w:val="0"/>
           <w:i w:val="0"/>
         </w:rPr>
-        <w:t>本報告回測一個假設性的台股當沖式策略：只要個股當天觸及漲停就假設能買到漲停價進場，再依當天收盤是否鎖死漲停分兩種方式出場。以 2026 年上半年全台股資料驗證，共偵測到 10061 筆漲停事件、涉及 1423 檔股票。整體策略的累積報酬率（非複利，逐日等權重報酬率加總）達 113.6%，統計檢定顯示鎖死與未鎖死兩組交易的報酬率差異在統計上高度顯著；但報告最後會說明，這個名目上的高報酬主要來自現實中最難成交的「鎖死」交易，實際可執行性存疑。</w:t>
+        <w:t>本報告回測一個假設性的台股當沖式策略：只要個股當天觸及漲停就假設能買到漲停價進場，再依當天收盤是否鎖死漲停分兩種方式出場。以 2026 年上半年全台股資料驗證，共偵測到 10061 筆漲停事件、涉及 1423 檔股票。整體策略的累積報酬率（非複利，逐日等權重報酬率加總）達 76.9%，統計檢定顯示鎖死與未鎖死兩組交易的報酬率差異在統計上高度顯著；但報告最後會說明，這個名目上的高報酬主要來自現實中最難成交的「鎖死」交易，實際可執行性存疑。</w:t>
       </w:r>
     </w:p>
     <w:p>
@@ -95,6 +95,16 @@
           <w:i w:val="0"/>
         </w:rPr>
         <w:t>漲停價計算：前一交易日收盤價 × 1.10，再依台灣證交所實際的升降單位（tick）規則無條件捨去到合法價位（例如股價 100~500 元 tick=0.5 元、500~1000 元 tick=1 元、≥1000 元 tick=5 元），確保跟交易所公告的真實漲停價一致。</w:t>
+      </w:r>
+    </w:p>
+    <w:p>
+      <w:r>
+        <w:rPr>
+          <w:rFonts w:ascii="微軟正黑體" w:hAnsi="微軟正黑體" w:eastAsia="微軟正黑體"/>
+          <w:b w:val="0"/>
+          <w:i w:val="0"/>
+        </w:rPr>
+        <w:t>交易成本：每筆交易都已扣除賣出時的證交稅（賣出成交價 × 0.3%，直接從損益中扣除），但買賣手續費（依券商折扣不同，概念上約為成交價的 0.1%~0.1425%）尚未計入，本報告後續所有報酬率、統計檢定與圖表都是「已扣證交稅、未扣手續費」下的結果。</w:t>
       </w:r>
     </w:p>
     <w:p>
@@ -282,7 +292,7 @@
           <w:b w:val="0"/>
           <w:i w:val="0"/>
         </w:rPr>
-        <w:t>把所有漲停事件的單筆報酬率畫成分布圖，鎖死組與未鎖死組幾乎沒有重疊：鎖死組集中在 0～+10% 之間（右側被 10% 硬上限截斷——因為隔天開盤價本身也受台股漲跌幅限制），未鎖死組則全部落在 0 以下。</w:t>
+        <w:t>把所有漲停事件的單筆報酬率畫成分布圖，鎖死組與未鎖死組幾乎沒有重疊：鎖死組集中在 0 附近到略低於 10% 之間（右側被台股漲跌幅限制加上證交稅共同截斷——隔天開盤價本身也受漲停限制，扣稅後上限略低於 10%），未鎖死組則全部落在 0 以下。</w:t>
       </w:r>
     </w:p>
     <w:p>
@@ -475,7 +485,7 @@
               <w:rPr>
                 <w:rFonts w:ascii="微軟正黑體" w:hAnsi="微軟正黑體" w:eastAsia="微軟正黑體"/>
               </w:rPr>
-              <w:t>113.6%</w:t>
+              <w:t>76.9%</w:t>
             </w:r>
           </w:p>
         </w:tc>
@@ -502,7 +512,7 @@
           <w:b w:val="0"/>
           <w:i w:val="0"/>
         </w:rPr>
-        <w:t>⚠️ 兩者計算方式不同，不是嚴謹的同基準比較：策略的數字是「每個交易日等權重平均、再逐日加總」的結果，代表的是「每次漲停訊號都用等量部位下注」的加總報酬，並非單一帳戶的複利成長；0050 則是單一部位、從頭到尾抱著不動的真實複利報酬。策略數字沒有扣除交易成本、也沒有考慮流動性與資金能否同時應付多檔同時漲停的限制（詳見「結論與限制」）。在此前提下，策略的名目數字高於 0050 同期表現，但不代表實際可以賺到這個差距。</w:t>
+        <w:t>⚠️ 兩者計算方式不同，不是嚴謹的同基準比較：策略的數字是「每個交易日等權重平均、再逐日加總」的結果，代表的是「每次漲停訊號都用等量部位下注」的加總報酬，並非單一帳戶的複利成長；0050 則是單一部位、從頭到尾抱著不動的真實複利報酬。策略數字雖已扣除賣出證交稅，但仍未扣手續費、也沒有考慮流動性與資金能否同時應付多檔同時漲停的限制（詳見「結論與限制」）。在此前提下，策略的名目數字高於 0050 同期表現，但不代表實際可以賺到這個差距。</w:t>
       </w:r>
     </w:p>
     <w:p>
@@ -523,7 +533,7 @@
           <w:b w:val="0"/>
           <w:i w:val="0"/>
         </w:rPr>
-        <w:t>統計上，「鎖死」與「未鎖死」兩組交易的報酬率差異非常顯著且穩定（詳見下一節統計檢定），整體策略每日平均報酬率 0.94%（121 個交易日，p=1.4e-07）。但「能不能賺錢」要看你實際能不能執行到這個策略的核心 — 也就是鎖死那部分（7250 筆，勝率 75.1%，平均 3.22%）：</w:t>
+        <w:t>統計上，「鎖死」與「未鎖死」兩組交易的報酬率差異非常顯著且穩定（詳見下一節統計檢定），整體策略每日平均報酬率 0.64%（121 個交易日，p=0.00022）。但「能不能賺錢」要看你實際能不能執行到這個策略的核心 — 也就是鎖死那部分（7250 筆，勝率 73.4%，平均 2.91%）：</w:t>
       </w:r>
     </w:p>
     <w:p>
@@ -556,7 +566,7 @@
         <w:rPr>
           <w:rFonts w:ascii="微軟正黑體" w:hAnsi="微軟正黑體" w:eastAsia="微軟正黑體"/>
         </w:rPr>
-        <w:t>完全沒有計入證交稅（賣出 0.3%）與手續費，也沒有考慮同一天數十檔同時漲停時，資金該怎麼分配的限制</w:t>
+        <w:t>已扣除賣出時的證交稅（0.3%），但手續費仍未計入，也沒有考慮同一天數十檔同時漲停時，資金該怎麼分配的限制</w:t>
       </w:r>
     </w:p>
     <w:p>
@@ -726,7 +736,7 @@
               <w:rPr>
                 <w:rFonts w:ascii="微軟正黑體" w:hAnsi="微軟正黑體" w:eastAsia="微軟正黑體"/>
               </w:rPr>
-              <w:t>0.94%</w:t>
+              <w:t>0.64%</w:t>
             </w:r>
           </w:p>
         </w:tc>
@@ -754,7 +764,7 @@
               <w:rPr>
                 <w:rFonts w:ascii="微軟正黑體" w:hAnsi="微軟正黑體" w:eastAsia="微軟正黑體"/>
               </w:rPr>
-              <w:t>5.60</w:t>
+              <w:t>3.81</w:t>
             </w:r>
           </w:p>
         </w:tc>
@@ -768,7 +778,7 @@
               <w:rPr>
                 <w:rFonts w:ascii="微軟正黑體" w:hAnsi="微軟正黑體" w:eastAsia="微軟正黑體"/>
               </w:rPr>
-              <w:t>1.38e-07</w:t>
+              <w:t>0.000225</w:t>
             </w:r>
           </w:p>
         </w:tc>
@@ -798,7 +808,7 @@
               <w:rPr>
                 <w:rFonts w:ascii="微軟正黑體" w:hAnsi="微軟正黑體" w:eastAsia="微軟正黑體"/>
               </w:rPr>
-              <w:t>3.07%</w:t>
+              <w:t>2.76%</w:t>
             </w:r>
           </w:p>
         </w:tc>
@@ -826,7 +836,7 @@
               <w:rPr>
                 <w:rFonts w:ascii="微軟正黑體" w:hAnsi="微軟正黑體" w:eastAsia="微軟正黑體"/>
               </w:rPr>
-              <w:t>17.94</w:t>
+              <w:t>16.18</w:t>
             </w:r>
           </w:p>
         </w:tc>
@@ -840,7 +850,7 @@
               <w:rPr>
                 <w:rFonts w:ascii="微軟正黑體" w:hAnsi="微軟正黑體" w:eastAsia="微軟正黑體"/>
               </w:rPr>
-              <w:t>1.24e-35</w:t>
+              <w:t>7.61e-32</w:t>
             </w:r>
           </w:p>
         </w:tc>
@@ -870,7 +880,7 @@
               <w:rPr>
                 <w:rFonts w:ascii="微軟正黑體" w:hAnsi="微軟正黑體" w:eastAsia="微軟正黑體"/>
               </w:rPr>
-              <w:t>-3.88%</w:t>
+              <w:t>-4.17%</w:t>
             </w:r>
           </w:p>
         </w:tc>
@@ -898,7 +908,7 @@
               <w:rPr>
                 <w:rFonts w:ascii="微軟正黑體" w:hAnsi="微軟正黑體" w:eastAsia="微軟正黑體"/>
               </w:rPr>
-              <w:t>-36.07</w:t>
+              <w:t>-38.87</w:t>
             </w:r>
           </w:p>
         </w:tc>
@@ -912,7 +922,7 @@
               <w:rPr>
                 <w:rFonts w:ascii="微軟正黑體" w:hAnsi="微軟正黑體" w:eastAsia="微軟正黑體"/>
               </w:rPr>
-              <w:t>2.98e-66</w:t>
+              <w:t>7.72e-70</w:t>
             </w:r>
           </w:p>
         </w:tc>
@@ -925,7 +935,7 @@
           <w:b w:val="0"/>
           <w:i w:val="0"/>
         </w:rPr>
-        <w:t>白話解讀：僅鎖死組平均每天賺 3.07%，p 值小到幾乎是 0，代表這不太可能是巧合；僅未鎖死組平均每天虧 3.88%，同樣是極端顯著的虧損；兩者混在一起的整體，平均每天賺 0.94%，也顯著大於 0。三個結果都指向同一個結論：是顯著的——鎖死賺、未鎖死虧這個規律在半年、上百個交易日裡反覆出現，不是少數幾天的好運撐出來的。</w:t>
+        <w:t>白話解讀：僅鎖死組平均每天賺 2.76%，p 值小到幾乎是 0，代表這不太可能是巧合；僅未鎖死組平均每天虧 4.17%，同樣是極端顯著的虧損；兩者混在一起的整體，平均每天賺 0.64%，也顯著不等於 0。三個結果都指向同一個結論：是顯著的——鎖死賺、未鎖死虧這個規律在半年、上百個交易日裡反覆出現，不是少數幾天的好運撐出來的（以上數字都已扣除賣出 0.3% 證交稅）。</w:t>
       </w:r>
     </w:p>
     <w:p>
@@ -1156,7 +1166,7 @@
               <w:rPr>
                 <w:rFonts w:ascii="微軟正黑體" w:hAnsi="微軟正黑體" w:eastAsia="微軟正黑體"/>
               </w:rPr>
-              <w:t>8.3e-78</w:t>
+              <w:t>8.35e-78</w:t>
             </w:r>
           </w:p>
         </w:tc>
@@ -1212,7 +1222,7 @@
         <w:rPr>
           <w:rFonts w:ascii="微軟正黑體" w:hAnsi="微軟正黑體" w:eastAsia="微軟正黑體"/>
         </w:rPr>
-        <w:t>沒有計入交易成本：證交稅（賣出 0.3%）、手續費都沒扣</w:t>
+        <w:t>已扣除賣出時的證交稅（0.3%），但手續費仍未計入</w:t>
       </w:r>
     </w:p>
     <w:p>

</xml_diff>